<commit_message>
Add interim Eyesel-data assumptions to board briefing and deck
New briefing section 6 and deck slide 12: fairness by mechanism while
Eyesel financials are pending - stated-basis peg with mandatory >15%
equalisation (Amendment A1), verified financials as CP to the share
exchange, escrow holdback fallback, method parity; planning numbers
($8.0M rev / 40% GM / $15-20M parity band); the >=~$18M value check;
and the block-entry decoupling of the FVH ratio from Eyesel data.
</commit_message>
<xml_diff>
--- a/synexo/GenApep_Director_Briefing.docx
+++ b/synexo/GenApep_Director_Briefing.docx
@@ -1363,7 +1363,402 @@
         <w:pStyle w:val="Heading2"/>
       </w:pPr>
       <w:r>
-        <w:t>6. What must be resolved before definitive documents</w:t>
+        <w:t>6. Fair without Eyesel's numbers — interim assumptions</w:t>
+      </w:r>
+    </w:p>
+    <w:p>
+      <w:pPr>
+        <w:spacing w:after="120"/>
+      </w:pPr>
+      <w:r>
+        <w:rPr>
+          <w:b w:val="0"/>
+          <w:i w:val="0"/>
+          <w:sz w:val="21"/>
+        </w:rPr>
+        <w:t>Eyesel's updated financial data is not yet available, and the 51:49 split rests on it. That does not block signing: fairness comes from mechanism, not from guessing the missing numbers. The four devices below let the parties commit now and correct automatically when the data arrives — the first is already drafted into Amendment No. 1.</w:t>
+      </w:r>
+    </w:p>
+    <w:p>
+      <w:pPr>
+        <w:pStyle w:val="Heading3"/>
+      </w:pPr>
+      <w:r>
+        <w:t>The four mechanisms</w:t>
+      </w:r>
+    </w:p>
+    <w:p>
+      <w:pPr>
+        <w:pStyle w:val="ListBullet"/>
+        <w:spacing w:after="60"/>
+      </w:pPr>
+      <w:r>
+        <w:rPr>
+          <w:b/>
+        </w:rPr>
+        <w:t xml:space="preserve">1. Peg + mandatory true-up (Amendment A1 — already drafted) — </w:t>
+      </w:r>
+      <w:r>
+        <w:t>Sign on a stated basis recorded on the face of the document (Eyesel revenue US$8.0M, value US$15–20M). If verified figures differ by &gt;15%, equalisation is MANDATORY — cash or share adjustment — with an independent valuer deciding if boards cannot agree in 30 days. Symmetric: it also protects Eyesel if its real numbers are higher.</w:t>
+      </w:r>
+    </w:p>
+    <w:p>
+      <w:pPr>
+        <w:pStyle w:val="ListBullet"/>
+        <w:spacing w:after="60"/>
+      </w:pPr>
+      <w:r>
+        <w:rPr>
+          <w:b/>
+        </w:rPr>
+        <w:t xml:space="preserve">2. Verified financials as a condition precedent to the share exchange — </w:t>
+      </w:r>
+      <w:r>
+        <w:t>Not to signing. The exchange is Q1–Q2 2027 and the PCAOB audit produces verified numbers on the critical path anyway — nothing is lost by signing the MOU and Amendment now.</w:t>
+      </w:r>
+    </w:p>
+    <w:p>
+      <w:pPr>
+        <w:pStyle w:val="ListBullet"/>
+        <w:spacing w:after="60"/>
+      </w:pPr>
+      <w:r>
+        <w:rPr>
+          <w:b/>
+        </w:rPr>
+        <w:t xml:space="preserve">3. Escrow holdback (fallback) — </w:t>
+      </w:r>
+      <w:r>
+        <w:t>If the 30-day report deadline slips: hold back 5–8 points of the Eyesel allocation in escrow, released or reallocated on verification.</w:t>
+      </w:r>
+    </w:p>
+    <w:p>
+      <w:pPr>
+        <w:pStyle w:val="ListBullet"/>
+        <w:spacing w:after="60"/>
+      </w:pPr>
+      <w:r>
+        <w:rPr>
+          <w:b/>
+        </w:rPr>
+        <w:t xml:space="preserve">4. Parity of method, not of number — </w:t>
+      </w:r>
+      <w:r>
+        <w:t>The same independent valuer applies the same valuation method and multiples to both companies (both are manufacturing-economics businesses). The parties agree the METHOD today; the numbers follow from the data.</w:t>
+      </w:r>
+    </w:p>
+    <w:p>
+      <w:pPr>
+        <w:pStyle w:val="Heading3"/>
+      </w:pPr>
+      <w:r>
+        <w:t>Planning numbers until the data arrives</w:t>
+      </w:r>
+    </w:p>
+    <w:tbl>
+      <w:tblPr>
+        <w:tblStyle w:val="LightGrid-Accent1"/>
+        <w:tblW w:type="auto" w:w="0"/>
+        <w:jc w:val="center"/>
+        <w:tblLook w:firstColumn="1" w:firstRow="1" w:lastColumn="0" w:lastRow="0" w:noHBand="0" w:noVBand="1" w:val="04A0"/>
+      </w:tblPr>
+      <w:tblGrid>
+        <w:gridCol w:w="2880"/>
+        <w:gridCol w:w="2880"/>
+        <w:gridCol w:w="2880"/>
+      </w:tblGrid>
+      <w:tr>
+        <w:tc>
+          <w:tcPr>
+            <w:tcW w:type="dxa" w:w="2016"/>
+          </w:tcPr>
+          <w:p>
+            <w:r>
+              <w:rPr>
+                <w:b/>
+                <w:sz w:val="19"/>
+              </w:rPr>
+              <w:t>Item</w:t>
+            </w:r>
+          </w:p>
+        </w:tc>
+        <w:tc>
+          <w:tcPr>
+            <w:tcW w:type="dxa" w:w="1584"/>
+          </w:tcPr>
+          <w:p>
+            <w:r>
+              <w:rPr>
+                <w:b/>
+                <w:sz w:val="19"/>
+              </w:rPr>
+              <w:t>Assumption</w:t>
+            </w:r>
+          </w:p>
+        </w:tc>
+        <w:tc>
+          <w:tcPr>
+            <w:tcW w:type="dxa" w:w="5760"/>
+          </w:tcPr>
+          <w:p>
+            <w:r>
+              <w:rPr>
+                <w:b/>
+                <w:sz w:val="19"/>
+              </w:rPr>
+              <w:t>Rationale</w:t>
+            </w:r>
+          </w:p>
+        </w:tc>
+      </w:tr>
+      <w:tr>
+        <w:tc>
+          <w:tcPr>
+            <w:tcW w:type="dxa" w:w="2016"/>
+          </w:tcPr>
+          <w:p>
+            <w:r>
+              <w:rPr>
+                <w:b/>
+                <w:sz w:val="19"/>
+              </w:rPr>
+              <w:t>Eyesel revenue</w:t>
+            </w:r>
+          </w:p>
+        </w:tc>
+        <w:tc>
+          <w:tcPr>
+            <w:tcW w:type="dxa" w:w="1584"/>
+          </w:tcPr>
+          <w:p>
+            <w:r>
+              <w:rPr>
+                <w:sz w:val="19"/>
+              </w:rPr>
+              <w:t>US$8.0M</w:t>
+            </w:r>
+          </w:p>
+        </w:tc>
+        <w:tc>
+          <w:tcPr>
+            <w:tcW w:type="dxa" w:w="5760"/>
+          </w:tcPr>
+          <w:p>
+            <w:r>
+              <w:rPr>
+                <w:sz w:val="19"/>
+              </w:rPr>
+              <w:t>The documented management-memo basis — the LOWER of the two circulating figures; conservative, and the true-up protects Eyesel if ~US$15M proves right</w:t>
+            </w:r>
+          </w:p>
+        </w:tc>
+      </w:tr>
+      <w:tr>
+        <w:tc>
+          <w:tcPr>
+            <w:tcW w:type="dxa" w:w="2016"/>
+          </w:tcPr>
+          <w:p>
+            <w:r>
+              <w:rPr>
+                <w:b/>
+                <w:sz w:val="19"/>
+              </w:rPr>
+              <w:t>Gross margin</w:t>
+            </w:r>
+          </w:p>
+        </w:tc>
+        <w:tc>
+          <w:tcPr>
+            <w:tcW w:type="dxa" w:w="1584"/>
+          </w:tcPr>
+          <w:p>
+            <w:r>
+              <w:rPr>
+                <w:sz w:val="19"/>
+              </w:rPr>
+              <w:t>40%</w:t>
+            </w:r>
+          </w:p>
+        </w:tc>
+        <w:tc>
+          <w:tcPr>
+            <w:tcW w:type="dxa" w:w="5760"/>
+          </w:tcPr>
+          <w:p>
+            <w:r>
+              <w:rPr>
+                <w:sz w:val="19"/>
+              </w:rPr>
+              <w:t>Mirrors WBI's NTS-certified FY2025 actual — same manufacturing economics</w:t>
+            </w:r>
+          </w:p>
+        </w:tc>
+      </w:tr>
+      <w:tr>
+        <w:tc>
+          <w:tcPr>
+            <w:tcW w:type="dxa" w:w="2016"/>
+          </w:tcPr>
+          <w:p>
+            <w:r>
+              <w:rPr>
+                <w:b/>
+                <w:sz w:val="19"/>
+              </w:rPr>
+              <w:t>EBITDA margin</w:t>
+            </w:r>
+          </w:p>
+        </w:tc>
+        <w:tc>
+          <w:tcPr>
+            <w:tcW w:type="dxa" w:w="1584"/>
+          </w:tcPr>
+          <w:p>
+            <w:r>
+              <w:rPr>
+                <w:sz w:val="19"/>
+              </w:rPr>
+              <w:t>~12%</w:t>
+            </w:r>
+          </w:p>
+        </w:tc>
+        <w:tc>
+          <w:tcPr>
+            <w:tcW w:type="dxa" w:w="5760"/>
+          </w:tcPr>
+          <w:p>
+            <w:r>
+              <w:rPr>
+                <w:sz w:val="19"/>
+              </w:rPr>
+              <w:t>Typical GMP-manufacturer profile; placeholder</w:t>
+            </w:r>
+          </w:p>
+        </w:tc>
+      </w:tr>
+      <w:tr>
+        <w:tc>
+          <w:tcPr>
+            <w:tcW w:type="dxa" w:w="2016"/>
+          </w:tcPr>
+          <w:p>
+            <w:r>
+              <w:rPr>
+                <w:b/>
+                <w:sz w:val="19"/>
+              </w:rPr>
+              <w:t>Growth</w:t>
+            </w:r>
+          </w:p>
+        </w:tc>
+        <w:tc>
+          <w:tcPr>
+            <w:tcW w:type="dxa" w:w="1584"/>
+          </w:tcPr>
+          <w:p>
+            <w:r>
+              <w:rPr>
+                <w:sz w:val="19"/>
+              </w:rPr>
+              <w:t>~10%/yr</w:t>
+            </w:r>
+          </w:p>
+        </w:tc>
+        <w:tc>
+          <w:tcPr>
+            <w:tcW w:type="dxa" w:w="5760"/>
+          </w:tcPr>
+          <w:p>
+            <w:r>
+              <w:rPr>
+                <w:sz w:val="19"/>
+              </w:rPr>
+              <w:t>JV plan placeholder</w:t>
+            </w:r>
+          </w:p>
+        </w:tc>
+      </w:tr>
+      <w:tr>
+        <w:tc>
+          <w:tcPr>
+            <w:tcW w:type="dxa" w:w="2016"/>
+          </w:tcPr>
+          <w:p>
+            <w:r>
+              <w:rPr>
+                <w:b/>
+                <w:sz w:val="19"/>
+              </w:rPr>
+              <w:t>Value band</w:t>
+            </w:r>
+          </w:p>
+        </w:tc>
+        <w:tc>
+          <w:tcPr>
+            <w:tcW w:type="dxa" w:w="1584"/>
+          </w:tcPr>
+          <w:p>
+            <w:r>
+              <w:rPr>
+                <w:sz w:val="19"/>
+              </w:rPr>
+              <w:t>US$15–20M</w:t>
+            </w:r>
+          </w:p>
+        </w:tc>
+        <w:tc>
+          <w:tcPr>
+            <w:tcW w:type="dxa" w:w="5760"/>
+          </w:tcPr>
+          <w:p>
+            <w:r>
+              <w:rPr>
+                <w:sz w:val="19"/>
+              </w:rPr>
+              <w:t>Same band as WBI — symmetric valuation-parity; prejudices neither side</w:t>
+            </w:r>
+          </w:p>
+        </w:tc>
+      </w:tr>
+    </w:tbl>
+    <w:p>
+      <w:pPr>
+        <w:spacing w:after="40"/>
+      </w:pPr>
+    </w:p>
+    <w:p>
+      <w:pPr>
+        <w:spacing w:after="120"/>
+      </w:pPr>
+      <w:r>
+        <w:rPr>
+          <w:b w:val="0"/>
+          <w:i w:val="0"/>
+          <w:sz w:val="21"/>
+        </w:rPr>
+        <w:t>The check to show both boards: on a pure value-proportional basis Eyesel needs a verified value of ≥ ~US$18M (against WBI's US$17.5M mid) to arithmetically support 51%. At US$8.0M revenue that likely requires counting the GMP facility, licences and quality systems as asset value — a legitimate argument, but one that must be documented, or equalisation applies. At ~US$15M revenue, 51:49 is comfortable.</w:t>
+      </w:r>
+    </w:p>
+    <w:p>
+      <w:pPr>
+        <w:spacing w:after="120"/>
+      </w:pPr>
+      <w:r>
+        <w:rPr>
+          <w:b/>
+          <w:i w:val="0"/>
+          <w:sz w:val="21"/>
+        </w:rPr>
+        <w:t>Structurally, the First Vital discussion never waits on Eyesel's data: under block entry the FVH ratio is GenApep-block vs FVH-verified-value, and the internal 51:49 trues up inside the block without touching the listed-company cap table. Only the internal split is gated — and it self-corrects.</w:t>
+      </w:r>
+    </w:p>
+    <w:p>
+      <w:pPr>
+        <w:pStyle w:val="Heading2"/>
+      </w:pPr>
+      <w:r>
+        <w:t>7. What must be resolved before definitive documents</w:t>
       </w:r>
     </w:p>
     <w:p>
@@ -1425,7 +1820,7 @@
         <w:pStyle w:val="Heading2"/>
       </w:pPr>
       <w:r>
-        <w:t>7. The financial picture (JV plan, planning basis)</w:t>
+        <w:t>8. The financial picture (JV plan, planning basis)</w:t>
       </w:r>
     </w:p>
     <w:tbl>
@@ -1757,7 +2152,7 @@
         <w:pStyle w:val="Heading2"/>
       </w:pPr>
       <w:r>
-        <w:t>8. Decisions requested</w:t>
+        <w:t>9. Decisions requested</w:t>
       </w:r>
     </w:p>
     <w:p>
@@ -1828,7 +2223,7 @@
         <w:pStyle w:val="Heading2"/>
       </w:pPr>
       <w:r>
-        <w:t>9. Document map</w:t>
+        <w:t>10. Document map</w:t>
       </w:r>
     </w:p>
     <w:tbl>

</xml_diff>